<commit_message>
Update Module 1.2 Assignment
</commit_message>
<xml_diff>
--- a/module-1/Shrestha-Assignment1_2.docx
+++ b/module-1/Shrestha-Assignment1_2.docx
@@ -107,6 +107,7 @@
       </w:pPr>
       <w:r>
         <w:rPr>
+          <w:rFonts w:ascii="Calibri" w:hAnsi="Calibri" w:cs="Calibri"/>
           <w:b/>
           <w:bCs/>
         </w:rPr>
@@ -122,6 +123,7 @@
       <w:r>
         <w:rPr>
           <w:rFonts w:ascii="Calibri" w:hAnsi="Calibri" w:cs="Calibri"/>
+          <w:noProof/>
         </w:rPr>
         <w:drawing>
           <wp:inline distT="0" distB="0" distL="0" distR="0" wp14:anchorId="196B9668" wp14:editId="4F75E1EF">
@@ -166,6 +168,70 @@
           <w:rFonts w:ascii="Calibri" w:hAnsi="Calibri" w:cs="Calibri"/>
         </w:rPr>
       </w:pPr>
+    </w:p>
+    <w:p>
+      <w:pPr>
+        <w:rPr>
+          <w:rFonts w:ascii="Calibri" w:hAnsi="Calibri" w:cs="Calibri"/>
+          <w:b/>
+          <w:bCs/>
+        </w:rPr>
+      </w:pPr>
+      <w:r>
+        <w:rPr>
+          <w:rFonts w:ascii="Calibri" w:hAnsi="Calibri" w:cs="Calibri"/>
+          <w:b/>
+          <w:bCs/>
+        </w:rPr>
+        <w:t>GitHub Repository</w:t>
+      </w:r>
+    </w:p>
+    <w:p>
+      <w:pPr>
+        <w:rPr>
+          <w:rFonts w:ascii="Calibri" w:hAnsi="Calibri" w:cs="Calibri"/>
+        </w:rPr>
+      </w:pPr>
+      <w:r>
+        <w:rPr>
+          <w:rFonts w:ascii="Calibri" w:hAnsi="Calibri" w:cs="Calibri"/>
+        </w:rPr>
+        <w:drawing>
+          <wp:inline distT="0" distB="0" distL="0" distR="0" wp14:anchorId="7B451CC1" wp14:editId="6BA4CBAD">
+            <wp:extent cx="6726132" cy="2449002"/>
+            <wp:effectExtent l="0" t="0" r="0" b="8890"/>
+            <wp:docPr id="1280905548" name="Picture 1"/>
+            <wp:cNvGraphicFramePr>
+              <a:graphicFrameLocks xmlns:a="http://schemas.openxmlformats.org/drawingml/2006/main" noChangeAspect="1"/>
+            </wp:cNvGraphicFramePr>
+            <a:graphic xmlns:a="http://schemas.openxmlformats.org/drawingml/2006/main">
+              <a:graphicData uri="http://schemas.openxmlformats.org/drawingml/2006/picture">
+                <pic:pic xmlns:pic="http://schemas.openxmlformats.org/drawingml/2006/picture">
+                  <pic:nvPicPr>
+                    <pic:cNvPr id="1280905548" name=""/>
+                    <pic:cNvPicPr/>
+                  </pic:nvPicPr>
+                  <pic:blipFill>
+                    <a:blip r:embed="rId6"/>
+                    <a:stretch>
+                      <a:fillRect/>
+                    </a:stretch>
+                  </pic:blipFill>
+                  <pic:spPr>
+                    <a:xfrm>
+                      <a:off x="0" y="0"/>
+                      <a:ext cx="6740806" cy="2454345"/>
+                    </a:xfrm>
+                    <a:prstGeom prst="rect">
+                      <a:avLst/>
+                    </a:prstGeom>
+                  </pic:spPr>
+                </pic:pic>
+              </a:graphicData>
+            </a:graphic>
+          </wp:inline>
+        </w:drawing>
+      </w:r>
     </w:p>
     <w:sectPr>
       <w:pgSz w:w="12240" w:h="15840"/>

</xml_diff>